<commit_message>
Dercy Parte 3: revisão
Co-Authored-By: Claude Opus 5.5 <noreply@anthropic.com>
Claude-Session: https://claude.ai/code/session_01MJjUEEZrxQDEUifKK2vj9g
</commit_message>
<xml_diff>
--- a/roteiros/dercy/Dercy_Parte3.docx
+++ b/roteiros/dercy/Dercy_Parte3.docx
@@ -39,7 +39,7 @@
         <w:rPr>
           <w:color w:val="000000"/>
         </w:rPr>
-        <w:t>Foi exatamente isso que, alguns anos depois, um governo inteiro quis calar.</w:t>
+        <w:t>E foi isso que, alguns anos depois, um governo inteiro quis calar.</w:t>
       </w:r>
     </w:p>
     <w:p>
@@ -79,7 +79,7 @@
         <w:rPr>
           <w:color w:val="000000"/>
         </w:rPr>
-        <w:t>O Brasil daquela época vivia sob uma ditadura militar.</w:t>
+        <w:t>Só que aquele Brasil vivia sob uma ditadura militar.</w:t>
       </w:r>
     </w:p>
     <w:p>
@@ -111,7 +111,7 @@
         <w:rPr>
           <w:color w:val="000000"/>
         </w:rPr>
-        <w:t>Em mil novecentos e sessenta e nove, a Censura Federal suspendeu o Dercy de Verdade por quinze dias.</w:t>
+        <w:t>Naquele ano, a Censura Federal suspendeu o Dercy de Verdade por quinze dias.</w:t>
       </w:r>
     </w:p>
     <w:p>
@@ -327,7 +327,7 @@
         <w:rPr>
           <w:color w:val="000000"/>
         </w:rPr>
-        <w:t>Uma coisa que quase ninguém sabia.</w:t>
+        <w:t>Uma coisa longe dos holofotes.</w:t>
       </w:r>
     </w:p>
     <w:p>
@@ -360,14 +360,6 @@
           <w:color w:val="000000"/>
         </w:rPr>
         <w:t>Lembra da pirâmide de vidro?</w:t>
-      </w:r>
-    </w:p>
-    <w:p>
-      <w:r>
-        <w:rPr>
-          <w:color w:val="000000"/>
-        </w:rPr>
-        <w:t>Foi ela quem pagou por ela.</w:t>
       </w:r>
     </w:p>
     <w:p>
@@ -431,15 +423,7 @@
         <w:rPr>
           <w:color w:val="000000"/>
         </w:rPr>
-        <w:t>Ali, em cima da sepultura que guardaria o corpo dela, conversou com um repórter sobre a morte como quem fala de uma viagem marcada.</w:t>
-      </w:r>
-    </w:p>
-    <w:p>
-      <w:r>
-        <w:rPr>
-          <w:color w:val="000000"/>
-        </w:rPr>
-        <w:t>Para quem estava perto, era uma cena difícil de esquecer.</w:t>
+        <w:t>Ali, em cima da sepultura que guardaria o corpo dela, conversou com um repórter sobre o lugar onde ia ser enterrada.</w:t>
       </w:r>
     </w:p>
     <w:p>

</xml_diff>